<commit_message>
Correct stories across five languages and prepare deployment
</commit_message>
<xml_diff>
--- a/az/wisdom-stories/Bakhtiyar Sirajov/discussion-and-conflict.docx
+++ b/az/wisdom-stories/Bakhtiyar Sirajov/discussion-and-conflict.docx
@@ -12,7 +12,7 @@
     </w:p>
     <w:p>
       <w:r>
-        <w:t>Hər gün olduğu kimi bu gün də üzərində işlədikləri layihənin vəziyyətini müzakirə etmək üçün Cavid bəy və heyəti toplantı otağına yığışmışdı. Hər kəs öncəki gün həm qazandığı uğurlu nəticələr, həm də qarşılaşdığı çətinliklər barədə qısaca məlumat verirdi.</w:t>
+        <w:t>Hər gün olduğu kimi, bu gün də Cavid bəy və komandası üzərində işlədikləri layihənin vəziyyətini müzakirə etmək üçün toplantı otağına yığışmışdı. Hər kəs əvvəlki gün əldə etdiyi nəticələr və qarşılaşdığı çətinliklər barədə qısaca məlumat verirdi.</w:t>
       </w:r>
     </w:p>
     <w:p>
@@ -46,7 +46,7 @@
     </w:p>
     <w:p>
       <w:r>
-        <w:t xml:space="preserve">Cavid bəy nə edəcəyini yaxşı bilirdi: təkbətək görüşüb dostcasına söhbət etmək. O, Nadiri bir stəkan çay içmək bəhanəsi ilə şirkətin kafesinə dəvət etdi, oradan-buradan söhbətdən sonra nəhayət əsas mətləbə keçdi və təmkinini pozmadan, aramla bunları dedi: «Oğlum, bu gün sənin Kamala qarşı rəftarın çox yanlış idi. Məsələnin əslini öyrənmədən, bilmədən kimisə suçlamaq, özü də başqalarının yanında, qəbuledilməzdir. Özünü onun yerinə qoy. Adam bizdən kömək gözlədiyi halda ittiham olunur. Əminəm ki, Kamal bizdən birlikdə oturub düşünməyimizi, məsələnin həllini birgə tapmağımızı umurdu.»</w:t>
+        <w:t>Cavid bəy nə edəcəyini yaxşı bilirdi: Nadirlə təkbətək görüşüb dostcasına söhbət etmək. O, Nadiri bir stəkan çay içmək bəhanəsi ilə şirkətin kafesinə dəvət etdi. Oradan-buradan söhbət etdikdən sonra əsas mətləbə keçib təmkinlə dedi: «Oğlum, bu gün sənin Kamala qarşı rəftarın çox yanlış idi. Məsələnin əslini öyrənmədən kimisə suçlamaq, özü də başqalarının yanında, qəbuledilməzdir. Özünü onun yerinə qoy. Adam bizdən kömək gözlədiyi halda ittiham olunur. Əminəm ki, Kamal birlikdə oturub düşünəcəyimizə, məsələnin həllini birgə tapacağımıza ümid edirdi».</w:t>
       </w:r>
     </w:p>
     <w:p>

</xml_diff>